<commit_message>
Update CSD 310 Assignment 1.2 with screenshots and repository link
</commit_message>
<xml_diff>
--- a/module-1/Young-Assignment1_2.docx
+++ b/module-1/Young-Assignment1_2.docx
@@ -73,7 +73,7 @@
     </w:p>
     <w:p>
       <w:pPr>
-        <w:spacing w:line="480" w:lineRule="auto"/>
+        <w:spacing w:line="240" w:lineRule="auto"/>
         <w:rPr>
           <w:rFonts w:ascii="Times New Roman" w:hAnsi="Times New Roman" w:cs="Times New Roman"/>
         </w:rPr>
@@ -81,7 +81,7 @@
     </w:p>
     <w:p>
       <w:pPr>
-        <w:spacing w:line="480" w:lineRule="auto"/>
+        <w:spacing w:line="240" w:lineRule="auto"/>
         <w:rPr>
           <w:rFonts w:ascii="Times New Roman" w:hAnsi="Times New Roman" w:cs="Times New Roman"/>
         </w:rPr>
@@ -140,6 +140,123 @@
           </wp:inline>
         </w:drawing>
       </w:r>
+    </w:p>
+    <w:p>
+      <w:pPr>
+        <w:spacing w:line="480" w:lineRule="auto"/>
+        <w:rPr>
+          <w:rFonts w:ascii="Times New Roman" w:hAnsi="Times New Roman" w:cs="Times New Roman"/>
+        </w:rPr>
+      </w:pPr>
+      <w:r>
+        <w:rPr>
+          <w:rFonts w:ascii="Times New Roman" w:hAnsi="Times New Roman" w:cs="Times New Roman"/>
+        </w:rPr>
+        <w:t>GitHub Repository URL:</w:t>
+      </w:r>
+    </w:p>
+    <w:p>
+      <w:pPr>
+        <w:spacing w:line="480" w:lineRule="auto"/>
+        <w:rPr>
+          <w:rFonts w:ascii="Times New Roman" w:hAnsi="Times New Roman" w:cs="Times New Roman"/>
+        </w:rPr>
+      </w:pPr>
+      <w:r>
+        <w:rPr>
+          <w:rFonts w:ascii="Times New Roman" w:hAnsi="Times New Roman" w:cs="Times New Roman"/>
+        </w:rPr>
+        <w:drawing>
+          <wp:inline distT="0" distB="0" distL="0" distR="0" wp14:anchorId="1B5C1069" wp14:editId="40A1BAA0">
+            <wp:extent cx="5943600" cy="1500505"/>
+            <wp:effectExtent l="0" t="0" r="0" b="4445"/>
+            <wp:docPr id="104777208" name="Picture 1"/>
+            <wp:cNvGraphicFramePr>
+              <a:graphicFrameLocks xmlns:a="http://schemas.openxmlformats.org/drawingml/2006/main" noChangeAspect="1"/>
+            </wp:cNvGraphicFramePr>
+            <a:graphic xmlns:a="http://schemas.openxmlformats.org/drawingml/2006/main">
+              <a:graphicData uri="http://schemas.openxmlformats.org/drawingml/2006/picture">
+                <pic:pic xmlns:pic="http://schemas.openxmlformats.org/drawingml/2006/picture">
+                  <pic:nvPicPr>
+                    <pic:cNvPr id="104777208" name=""/>
+                    <pic:cNvPicPr/>
+                  </pic:nvPicPr>
+                  <pic:blipFill>
+                    <a:blip r:embed="rId5"/>
+                    <a:stretch>
+                      <a:fillRect/>
+                    </a:stretch>
+                  </pic:blipFill>
+                  <pic:spPr>
+                    <a:xfrm>
+                      <a:off x="0" y="0"/>
+                      <a:ext cx="5943600" cy="1500505"/>
+                    </a:xfrm>
+                    <a:prstGeom prst="rect">
+                      <a:avLst/>
+                    </a:prstGeom>
+                  </pic:spPr>
+                </pic:pic>
+              </a:graphicData>
+            </a:graphic>
+          </wp:inline>
+        </w:drawing>
+      </w:r>
+    </w:p>
+    <w:p>
+      <w:pPr>
+        <w:spacing w:line="240" w:lineRule="auto"/>
+        <w:rPr>
+          <w:rFonts w:ascii="Times New Roman" w:hAnsi="Times New Roman" w:cs="Times New Roman"/>
+        </w:rPr>
+      </w:pPr>
+      <w:r>
+        <w:rPr>
+          <w:rFonts w:ascii="Times New Roman" w:hAnsi="Times New Roman" w:cs="Times New Roman"/>
+        </w:rPr>
+        <w:t>GitHub Repository URL:</w:t>
+      </w:r>
+    </w:p>
+    <w:p>
+      <w:pPr>
+        <w:spacing w:line="240" w:lineRule="auto"/>
+        <w:rPr>
+          <w:rFonts w:ascii="Times New Roman" w:hAnsi="Times New Roman" w:cs="Times New Roman"/>
+        </w:rPr>
+      </w:pPr>
+      <w:hyperlink r:id="rId6" w:history="1">
+        <w:r>
+          <w:rPr>
+            <w:rStyle w:val="Hyperlink"/>
+            <w:rFonts w:ascii="Times New Roman" w:hAnsi="Times New Roman" w:cs="Times New Roman"/>
+          </w:rPr>
+          <w:t>https://github.com/scottyoung753/csd-310</w:t>
+        </w:r>
+      </w:hyperlink>
+    </w:p>
+    <w:p>
+      <w:pPr>
+        <w:spacing w:line="240" w:lineRule="auto"/>
+        <w:rPr>
+          <w:rFonts w:ascii="Times New Roman" w:hAnsi="Times New Roman" w:cs="Times New Roman"/>
+        </w:rPr>
+      </w:pPr>
+    </w:p>
+    <w:p>
+      <w:pPr>
+        <w:spacing w:line="480" w:lineRule="auto"/>
+        <w:rPr>
+          <w:rFonts w:ascii="Times New Roman" w:hAnsi="Times New Roman" w:cs="Times New Roman"/>
+        </w:rPr>
+      </w:pPr>
+    </w:p>
+    <w:p>
+      <w:pPr>
+        <w:spacing w:line="480" w:lineRule="auto"/>
+        <w:rPr>
+          <w:rFonts w:ascii="Times New Roman" w:hAnsi="Times New Roman" w:cs="Times New Roman"/>
+        </w:rPr>
+      </w:pPr>
     </w:p>
     <w:sectPr>
       <w:pgSz w:w="12240" w:h="15840"/>
@@ -754,7 +871,6 @@
   <w:style w:type="character" w:default="1" w:styleId="DefaultParagraphFont">
     <w:name w:val="Default Paragraph Font"/>
     <w:uiPriority w:val="1"/>
-    <w:semiHidden/>
     <w:unhideWhenUsed/>
   </w:style>
   <w:style w:type="table" w:default="1" w:styleId="TableNormal">
@@ -1066,6 +1182,29 @@
       <w:smallCaps/>
       <w:color w:val="0F4761" w:themeColor="accent1" w:themeShade="BF"/>
       <w:spacing w:val="5"/>
+    </w:rPr>
+  </w:style>
+  <w:style w:type="character" w:styleId="Hyperlink">
+    <w:name w:val="Hyperlink"/>
+    <w:basedOn w:val="DefaultParagraphFont"/>
+    <w:uiPriority w:val="99"/>
+    <w:unhideWhenUsed/>
+    <w:rsid w:val="00AB278C"/>
+    <w:rPr>
+      <w:color w:val="467886" w:themeColor="hyperlink"/>
+      <w:u w:val="single"/>
+    </w:rPr>
+  </w:style>
+  <w:style w:type="character" w:styleId="UnresolvedMention">
+    <w:name w:val="Unresolved Mention"/>
+    <w:basedOn w:val="DefaultParagraphFont"/>
+    <w:uiPriority w:val="99"/>
+    <w:semiHidden/>
+    <w:unhideWhenUsed/>
+    <w:rsid w:val="00AB278C"/>
+    <w:rPr>
+      <w:color w:val="605E5C"/>
+      <w:shd w:val="clear" w:color="auto" w:fill="E1DFDD"/>
     </w:rPr>
   </w:style>
 </w:styles>

</xml_diff>

<commit_message>
Finalize CSD 310 Assignment 1.2
</commit_message>
<xml_diff>
--- a/module-1/Young-Assignment1_2.docx
+++ b/module-1/Young-Assignment1_2.docx
@@ -76,6 +76,8 @@
         <w:spacing w:line="240" w:lineRule="auto"/>
         <w:rPr>
           <w:rFonts w:ascii="Times New Roman" w:hAnsi="Times New Roman" w:cs="Times New Roman"/>
+          <w:b/>
+          <w:bCs/>
         </w:rPr>
       </w:pPr>
     </w:p>
@@ -84,11 +86,15 @@
         <w:spacing w:line="240" w:lineRule="auto"/>
         <w:rPr>
           <w:rFonts w:ascii="Times New Roman" w:hAnsi="Times New Roman" w:cs="Times New Roman"/>
+          <w:b/>
+          <w:bCs/>
         </w:rPr>
       </w:pPr>
       <w:r>
         <w:rPr>
           <w:rFonts w:ascii="Times New Roman" w:hAnsi="Times New Roman" w:cs="Times New Roman"/>
+          <w:b/>
+          <w:bCs/>
         </w:rPr>
         <w:t>Local Directory Screenshot</w:t>
       </w:r>
@@ -103,6 +109,7 @@
       <w:r>
         <w:rPr>
           <w:rFonts w:ascii="Times New Roman" w:hAnsi="Times New Roman" w:cs="Times New Roman"/>
+          <w:noProof/>
         </w:rPr>
         <w:drawing>
           <wp:inline distT="0" distB="0" distL="0" distR="0" wp14:anchorId="785D85DB" wp14:editId="488EB4ED">
@@ -146,13 +153,33 @@
         <w:spacing w:line="480" w:lineRule="auto"/>
         <w:rPr>
           <w:rFonts w:ascii="Times New Roman" w:hAnsi="Times New Roman" w:cs="Times New Roman"/>
+          <w:b/>
+          <w:bCs/>
         </w:rPr>
       </w:pPr>
       <w:r>
         <w:rPr>
           <w:rFonts w:ascii="Times New Roman" w:hAnsi="Times New Roman" w:cs="Times New Roman"/>
-        </w:rPr>
-        <w:t>GitHub Repository URL:</w:t>
+          <w:b/>
+          <w:bCs/>
+        </w:rPr>
+        <w:t xml:space="preserve">GitHub Repository </w:t>
+      </w:r>
+      <w:r>
+        <w:rPr>
+          <w:rFonts w:ascii="Times New Roman" w:hAnsi="Times New Roman" w:cs="Times New Roman"/>
+          <w:b/>
+          <w:bCs/>
+        </w:rPr>
+        <w:t>S</w:t>
+      </w:r>
+      <w:r>
+        <w:rPr>
+          <w:rFonts w:ascii="Times New Roman" w:hAnsi="Times New Roman" w:cs="Times New Roman"/>
+          <w:b/>
+          <w:bCs/>
+        </w:rPr>
+        <w:t>creenshot</w:t>
       </w:r>
     </w:p>
     <w:p>
@@ -165,6 +192,7 @@
       <w:r>
         <w:rPr>
           <w:rFonts w:ascii="Times New Roman" w:hAnsi="Times New Roman" w:cs="Times New Roman"/>
+          <w:noProof/>
         </w:rPr>
         <w:drawing>
           <wp:inline distT="0" distB="0" distL="0" distR="0" wp14:anchorId="1B5C1069" wp14:editId="40A1BAA0">
@@ -208,11 +236,15 @@
         <w:spacing w:line="240" w:lineRule="auto"/>
         <w:rPr>
           <w:rFonts w:ascii="Times New Roman" w:hAnsi="Times New Roman" w:cs="Times New Roman"/>
+          <w:b/>
+          <w:bCs/>
         </w:rPr>
       </w:pPr>
       <w:r>
         <w:rPr>
           <w:rFonts w:ascii="Times New Roman" w:hAnsi="Times New Roman" w:cs="Times New Roman"/>
+          <w:b/>
+          <w:bCs/>
         </w:rPr>
         <w:t>GitHub Repository URL:</w:t>
       </w:r>
@@ -871,6 +903,7 @@
   <w:style w:type="character" w:default="1" w:styleId="DefaultParagraphFont">
     <w:name w:val="Default Paragraph Font"/>
     <w:uiPriority w:val="1"/>
+    <w:semiHidden/>
     <w:unhideWhenUsed/>
   </w:style>
   <w:style w:type="table" w:default="1" w:styleId="TableNormal">

</xml_diff>